<commit_message>
implemented printing fixation slugbova
</commit_message>
<xml_diff>
--- a/RightholderWorkplace/Templates/F_АКТ Ідентифікація.docx
+++ b/RightholderWorkplace/Templates/F_АКТ Ідентифікація.docx
@@ -117,73 +117,17 @@
           <w:placeholder>
             <w:docPart w:val="DefaultPlaceholder_1082065158"/>
           </w:placeholder>
+          <w:showingPlcHdr/>
+          <w15:appearance w15:val="tags"/>
           <w:text/>
         </w:sdtPr>
         <w:sdtEndPr/>
         <w:sdtContent>
           <w:r>
             <w:rPr>
-              <w:sz w:val="20"/>
-              <w:szCs w:val="20"/>
-              <w:lang w:val="uk-UA"/>
+              <w:rStyle w:val="af4"/>
             </w:rPr>
-            <w:t>«</w:t>
-          </w:r>
-          <w:r>
-            <w:rPr>
-              <w:sz w:val="20"/>
-              <w:szCs w:val="20"/>
-              <w:lang w:val="uk-UA"/>
-            </w:rPr>
-            <w:t>___</w:t>
-          </w:r>
-          <w:r>
-            <w:rPr>
-              <w:sz w:val="20"/>
-              <w:szCs w:val="20"/>
-              <w:lang w:val="uk-UA"/>
-            </w:rPr>
-            <w:t>»</w:t>
-          </w:r>
-          <w:r>
-            <w:rPr>
-              <w:sz w:val="20"/>
-              <w:szCs w:val="20"/>
-              <w:lang w:val="uk-UA"/>
-            </w:rPr>
-            <w:t xml:space="preserve"> </w:t>
-          </w:r>
-          <w:r>
-            <w:rPr>
-              <w:sz w:val="20"/>
-              <w:szCs w:val="20"/>
-              <w:lang w:val="uk-UA"/>
-            </w:rPr>
-            <w:t>_______</w:t>
-          </w:r>
-          <w:r>
-            <w:rPr>
-              <w:sz w:val="20"/>
-              <w:szCs w:val="20"/>
-              <w:lang w:val="uk-UA"/>
-            </w:rPr>
-            <w:t xml:space="preserve"> 20</w:t>
-          </w:r>
-          <w:r>
-            <w:rPr>
-              <w:sz w:val="20"/>
-              <w:szCs w:val="20"/>
-              <w:lang w:val="uk-UA"/>
-            </w:rPr>
-            <w:t>__</w:t>
-          </w:r>
-          <w:r>
-            <w:rPr>
-              <w:sz w:val="20"/>
-              <w:szCs w:val="20"/>
-              <w:lang w:val="uk-UA"/>
-            </w:rPr>
-            <w:t xml:space="preserve"> р.</w:t>
+            <w:t>Место для ввода текста.</w:t>
           </w:r>
         </w:sdtContent>
       </w:sdt>
@@ -193,39 +137,23 @@
           <w:szCs w:val="20"/>
           <w:lang w:val="uk-UA"/>
         </w:rPr>
-        <w:t xml:space="preserve">                                       </w:t>
-      </w:r>
-      <w:r>
-        <w:rPr>
-          <w:sz w:val="20"/>
-          <w:szCs w:val="20"/>
-          <w:lang w:val="uk-UA"/>
-        </w:rPr>
-        <w:t xml:space="preserve">                  № 17-0</w:t>
-      </w:r>
-      <w:r>
-        <w:rPr>
-          <w:sz w:val="20"/>
-          <w:szCs w:val="20"/>
-          <w:lang w:val="uk-UA"/>
-        </w:rPr>
-        <w:t>3</w:t>
-      </w:r>
-      <w:r>
-        <w:rPr>
-          <w:sz w:val="20"/>
-          <w:szCs w:val="20"/>
-          <w:lang w:val="uk-UA"/>
-        </w:rPr>
-        <w:t>-</w:t>
-      </w:r>
-      <w:r>
-        <w:rPr>
-          <w:sz w:val="20"/>
-          <w:szCs w:val="20"/>
-          <w:lang w:val="uk-UA"/>
-        </w:rPr>
-        <w:t>20</w:t>
+        <w:t xml:space="preserve">                      </w:t>
+      </w:r>
+      <w:r>
+        <w:rPr>
+          <w:sz w:val="20"/>
+          <w:szCs w:val="20"/>
+          <w:lang w:val="uk-UA"/>
+        </w:rPr>
+        <w:t xml:space="preserve">   № </w:t>
+      </w:r>
+      <w:r>
+        <w:rPr>
+          <w:sz w:val="20"/>
+          <w:szCs w:val="20"/>
+          <w:lang w:val="uk-UA"/>
+        </w:rPr>
+        <w:t>_________</w:t>
       </w:r>
       <w:r>
         <w:rPr>
@@ -285,6 +213,7 @@
             <w:docPart w:val="DefaultPlaceholder_1082065158"/>
           </w:placeholder>
           <w:showingPlcHdr/>
+          <w15:appearance w15:val="tags"/>
           <w:text/>
         </w:sdtPr>
         <w:sdtEndPr/>
@@ -326,6 +255,7 @@
             <w:docPart w:val="DefaultPlaceholder_1082065158"/>
           </w:placeholder>
           <w:showingPlcHdr/>
+          <w15:appearance w15:val="tags"/>
           <w:text/>
         </w:sdtPr>
         <w:sdtEndPr/>
@@ -420,466 +350,554 @@
         <w:t>, виявлено факт публічного сповіщення наступних оприлюднених творів:</w:t>
       </w:r>
     </w:p>
-    <w:tbl>
-      <w:tblPr>
-        <w:tblW w:w="10869" w:type="dxa"/>
-        <w:tblInd w:w="108" w:type="dxa"/>
-        <w:tblLayout w:type="fixed"/>
-        <w:tblLook w:val="0000" w:firstRow="0" w:lastRow="0" w:firstColumn="0" w:lastColumn="0" w:noHBand="0" w:noVBand="0"/>
-      </w:tblPr>
-      <w:tblGrid>
-        <w:gridCol w:w="426"/>
-        <w:gridCol w:w="992"/>
-        <w:gridCol w:w="1231"/>
-        <w:gridCol w:w="663"/>
-        <w:gridCol w:w="709"/>
-        <w:gridCol w:w="1933"/>
-        <w:gridCol w:w="1417"/>
-        <w:gridCol w:w="993"/>
-        <w:gridCol w:w="933"/>
-        <w:gridCol w:w="1572"/>
-      </w:tblGrid>
-      <w:tr>
-        <w:trPr>
-          <w:trHeight w:val="638"/>
-        </w:trPr>
-        <w:tc>
-          <w:tcPr>
-            <w:tcW w:w="426" w:type="dxa"/>
-            <w:tcBorders>
-              <w:top w:val="single" w:sz="4" w:space="0" w:color="000000"/>
-              <w:left w:val="single" w:sz="4" w:space="0" w:color="000000"/>
-              <w:bottom w:val="single" w:sz="4" w:space="0" w:color="000000"/>
-            </w:tcBorders>
-            <w:shd w:val="clear" w:color="auto" w:fill="auto"/>
-            <w:vAlign w:val="center"/>
-          </w:tcPr>
-          <w:p>
-            <w:pPr>
-              <w:jc w:val="center"/>
-              <w:rPr>
-                <w:sz w:val="16"/>
-                <w:szCs w:val="16"/>
-                <w:lang w:val="uk-UA"/>
-              </w:rPr>
-            </w:pPr>
-            <w:r>
-              <w:rPr>
-                <w:sz w:val="16"/>
-                <w:szCs w:val="16"/>
-                <w:lang w:val="uk-UA"/>
-              </w:rPr>
-              <w:t>№ п/п</w:t>
-            </w:r>
-          </w:p>
-        </w:tc>
-        <w:tc>
-          <w:tcPr>
-            <w:tcW w:w="992" w:type="dxa"/>
-            <w:tcBorders>
-              <w:top w:val="single" w:sz="4" w:space="0" w:color="000000"/>
-              <w:left w:val="single" w:sz="4" w:space="0" w:color="000000"/>
-              <w:bottom w:val="single" w:sz="4" w:space="0" w:color="000000"/>
-            </w:tcBorders>
-            <w:shd w:val="clear" w:color="auto" w:fill="auto"/>
-            <w:vAlign w:val="center"/>
-          </w:tcPr>
-          <w:p>
-            <w:pPr>
-              <w:jc w:val="center"/>
-              <w:rPr>
-                <w:sz w:val="16"/>
-                <w:szCs w:val="16"/>
-              </w:rPr>
-            </w:pPr>
-            <w:r>
-              <w:rPr>
-                <w:sz w:val="16"/>
-                <w:szCs w:val="16"/>
-                <w:lang w:val="uk-UA"/>
-              </w:rPr>
-              <w:t>Назва твору</w:t>
-            </w:r>
-          </w:p>
-        </w:tc>
-        <w:tc>
-          <w:tcPr>
-            <w:tcW w:w="1231" w:type="dxa"/>
-            <w:tcBorders>
-              <w:top w:val="single" w:sz="4" w:space="0" w:color="000000"/>
-              <w:left w:val="single" w:sz="4" w:space="0" w:color="000000"/>
-              <w:bottom w:val="single" w:sz="4" w:space="0" w:color="000000"/>
-            </w:tcBorders>
-            <w:shd w:val="clear" w:color="auto" w:fill="auto"/>
-            <w:vAlign w:val="center"/>
-          </w:tcPr>
-          <w:p>
-            <w:pPr>
-              <w:jc w:val="center"/>
-              <w:rPr>
-                <w:sz w:val="16"/>
-                <w:szCs w:val="16"/>
-              </w:rPr>
-            </w:pPr>
-            <w:proofErr w:type="spellStart"/>
-            <w:r>
-              <w:rPr>
-                <w:sz w:val="16"/>
-                <w:szCs w:val="16"/>
-              </w:rPr>
-              <w:t>Викона</w:t>
-            </w:r>
-            <w:proofErr w:type="spellEnd"/>
-            <w:r>
-              <w:rPr>
-                <w:sz w:val="16"/>
-                <w:szCs w:val="16"/>
-              </w:rPr>
-              <w:t>-</w:t>
-            </w:r>
-          </w:p>
-          <w:p>
-            <w:pPr>
-              <w:jc w:val="center"/>
-              <w:rPr>
-                <w:sz w:val="16"/>
-                <w:szCs w:val="16"/>
-              </w:rPr>
-            </w:pPr>
-            <w:proofErr w:type="spellStart"/>
-            <w:r>
-              <w:rPr>
-                <w:sz w:val="16"/>
-                <w:szCs w:val="16"/>
-              </w:rPr>
-              <w:t>вець</w:t>
-            </w:r>
-            <w:proofErr w:type="spellEnd"/>
-          </w:p>
-        </w:tc>
-        <w:tc>
-          <w:tcPr>
-            <w:tcW w:w="663" w:type="dxa"/>
-            <w:tcBorders>
-              <w:top w:val="single" w:sz="4" w:space="0" w:color="000000"/>
-              <w:left w:val="single" w:sz="4" w:space="0" w:color="000000"/>
-              <w:bottom w:val="single" w:sz="4" w:space="0" w:color="000000"/>
-            </w:tcBorders>
-            <w:vAlign w:val="center"/>
-          </w:tcPr>
-          <w:p>
-            <w:pPr>
-              <w:jc w:val="center"/>
-              <w:rPr>
-                <w:sz w:val="16"/>
-                <w:szCs w:val="16"/>
-                <w:lang w:val="uk-UA"/>
-              </w:rPr>
-            </w:pPr>
-            <w:r>
-              <w:rPr>
-                <w:sz w:val="16"/>
-                <w:szCs w:val="16"/>
-                <w:lang w:val="uk-UA"/>
-              </w:rPr>
-              <w:t>Час початку звучання твору *</w:t>
-            </w:r>
-          </w:p>
-        </w:tc>
-        <w:tc>
-          <w:tcPr>
-            <w:tcW w:w="709" w:type="dxa"/>
-            <w:tcBorders>
-              <w:top w:val="single" w:sz="4" w:space="0" w:color="000000"/>
-              <w:left w:val="single" w:sz="4" w:space="0" w:color="000000"/>
-              <w:bottom w:val="single" w:sz="4" w:space="0" w:color="000000"/>
-              <w:right w:val="single" w:sz="4" w:space="0" w:color="000000"/>
-            </w:tcBorders>
-            <w:vAlign w:val="center"/>
-          </w:tcPr>
-          <w:p>
-            <w:pPr>
-              <w:jc w:val="center"/>
-              <w:rPr>
-                <w:sz w:val="16"/>
-                <w:szCs w:val="16"/>
-                <w:lang w:val="uk-UA"/>
-              </w:rPr>
-            </w:pPr>
-            <w:r>
-              <w:rPr>
-                <w:sz w:val="16"/>
-                <w:szCs w:val="16"/>
-                <w:lang w:val="uk-UA"/>
-              </w:rPr>
-              <w:t>Час закінчення звучання твору *</w:t>
-            </w:r>
-          </w:p>
-        </w:tc>
-        <w:tc>
-          <w:tcPr>
-            <w:tcW w:w="1933" w:type="dxa"/>
-            <w:tcBorders>
-              <w:top w:val="single" w:sz="4" w:space="0" w:color="000000"/>
-              <w:left w:val="single" w:sz="4" w:space="0" w:color="000000"/>
-              <w:bottom w:val="single" w:sz="4" w:space="0" w:color="000000"/>
-            </w:tcBorders>
-            <w:shd w:val="clear" w:color="auto" w:fill="auto"/>
-            <w:vAlign w:val="center"/>
-          </w:tcPr>
-          <w:p>
-            <w:pPr>
-              <w:jc w:val="center"/>
-              <w:rPr>
-                <w:sz w:val="16"/>
-                <w:szCs w:val="16"/>
-              </w:rPr>
-            </w:pPr>
-            <w:proofErr w:type="spellStart"/>
-            <w:r>
-              <w:rPr>
-                <w:sz w:val="16"/>
-                <w:szCs w:val="16"/>
-              </w:rPr>
-              <w:t>Творча</w:t>
-            </w:r>
-            <w:proofErr w:type="spellEnd"/>
-            <w:r>
-              <w:rPr>
-                <w:sz w:val="16"/>
-                <w:szCs w:val="16"/>
-              </w:rPr>
-              <w:t xml:space="preserve"> роль</w:t>
-            </w:r>
-          </w:p>
-        </w:tc>
-        <w:tc>
-          <w:tcPr>
-            <w:tcW w:w="1417" w:type="dxa"/>
-            <w:tcBorders>
-              <w:top w:val="single" w:sz="4" w:space="0" w:color="000000"/>
-              <w:left w:val="single" w:sz="4" w:space="0" w:color="000000"/>
-              <w:bottom w:val="single" w:sz="4" w:space="0" w:color="000000"/>
-            </w:tcBorders>
-            <w:shd w:val="clear" w:color="auto" w:fill="auto"/>
-            <w:vAlign w:val="center"/>
-          </w:tcPr>
-          <w:p>
-            <w:pPr>
-              <w:jc w:val="center"/>
-              <w:rPr>
-                <w:sz w:val="16"/>
-                <w:szCs w:val="16"/>
-              </w:rPr>
-            </w:pPr>
-            <w:proofErr w:type="spellStart"/>
-            <w:r>
-              <w:rPr>
-                <w:sz w:val="16"/>
-                <w:szCs w:val="16"/>
-              </w:rPr>
-              <w:t>Ім’я</w:t>
-            </w:r>
-            <w:proofErr w:type="spellEnd"/>
-            <w:r>
-              <w:rPr>
-                <w:sz w:val="16"/>
-                <w:szCs w:val="16"/>
-              </w:rPr>
-              <w:t xml:space="preserve"> / </w:t>
-            </w:r>
-            <w:proofErr w:type="spellStart"/>
-            <w:r>
-              <w:rPr>
-                <w:sz w:val="16"/>
-                <w:szCs w:val="16"/>
-              </w:rPr>
-              <w:t>Назва</w:t>
-            </w:r>
-            <w:proofErr w:type="spellEnd"/>
-            <w:r>
-              <w:rPr>
-                <w:sz w:val="16"/>
-                <w:szCs w:val="16"/>
-              </w:rPr>
-              <w:t xml:space="preserve"> / </w:t>
-            </w:r>
-            <w:proofErr w:type="spellStart"/>
-            <w:r>
-              <w:rPr>
-                <w:sz w:val="16"/>
-                <w:szCs w:val="16"/>
-              </w:rPr>
-              <w:t>Оригінальний</w:t>
-            </w:r>
-            <w:proofErr w:type="spellEnd"/>
-            <w:r>
-              <w:rPr>
-                <w:sz w:val="16"/>
-                <w:szCs w:val="16"/>
-              </w:rPr>
-              <w:t xml:space="preserve"> </w:t>
-            </w:r>
-            <w:proofErr w:type="spellStart"/>
-            <w:r>
-              <w:rPr>
-                <w:sz w:val="16"/>
-                <w:szCs w:val="16"/>
-              </w:rPr>
-              <w:t>правовласник</w:t>
-            </w:r>
-            <w:proofErr w:type="spellEnd"/>
-          </w:p>
-        </w:tc>
-        <w:tc>
-          <w:tcPr>
-            <w:tcW w:w="993" w:type="dxa"/>
-            <w:tcBorders>
-              <w:top w:val="single" w:sz="4" w:space="0" w:color="000000"/>
-              <w:left w:val="single" w:sz="4" w:space="0" w:color="000000"/>
-              <w:bottom w:val="single" w:sz="4" w:space="0" w:color="000000"/>
-            </w:tcBorders>
-            <w:shd w:val="clear" w:color="auto" w:fill="auto"/>
-            <w:vAlign w:val="center"/>
-          </w:tcPr>
-          <w:p>
-            <w:pPr>
-              <w:jc w:val="center"/>
-              <w:rPr>
-                <w:sz w:val="16"/>
-                <w:szCs w:val="16"/>
-              </w:rPr>
-            </w:pPr>
-            <w:proofErr w:type="spellStart"/>
-            <w:r>
-              <w:rPr>
-                <w:sz w:val="16"/>
-                <w:szCs w:val="16"/>
-              </w:rPr>
-              <w:t>Іноземне</w:t>
-            </w:r>
-            <w:proofErr w:type="spellEnd"/>
-            <w:r>
-              <w:rPr>
-                <w:sz w:val="16"/>
-                <w:szCs w:val="16"/>
-                <w:lang w:val="uk-UA"/>
-              </w:rPr>
-              <w:t xml:space="preserve"> авторсько-правове товариство</w:t>
-            </w:r>
-          </w:p>
-        </w:tc>
-        <w:tc>
-          <w:tcPr>
-            <w:tcW w:w="933" w:type="dxa"/>
-            <w:tcBorders>
-              <w:top w:val="single" w:sz="4" w:space="0" w:color="000000"/>
-              <w:left w:val="single" w:sz="4" w:space="0" w:color="000000"/>
-              <w:bottom w:val="single" w:sz="4" w:space="0" w:color="000000"/>
-            </w:tcBorders>
-            <w:shd w:val="clear" w:color="auto" w:fill="auto"/>
-            <w:vAlign w:val="center"/>
-          </w:tcPr>
-          <w:p>
-            <w:pPr>
-              <w:jc w:val="center"/>
-              <w:rPr>
-                <w:sz w:val="16"/>
-                <w:szCs w:val="16"/>
-                <w:lang w:val="uk-UA"/>
-              </w:rPr>
-            </w:pPr>
-            <w:proofErr w:type="spellStart"/>
-            <w:r>
-              <w:rPr>
-                <w:sz w:val="16"/>
-                <w:szCs w:val="16"/>
-              </w:rPr>
-              <w:t>Частка</w:t>
-            </w:r>
-            <w:proofErr w:type="spellEnd"/>
-            <w:r>
-              <w:rPr>
-                <w:sz w:val="16"/>
-                <w:szCs w:val="16"/>
-                <w:lang w:val="uk-UA"/>
-              </w:rPr>
-              <w:t xml:space="preserve"> належної авторської винагороди</w:t>
-            </w:r>
-          </w:p>
-        </w:tc>
-        <w:tc>
-          <w:tcPr>
-            <w:tcW w:w="1572" w:type="dxa"/>
-            <w:tcBorders>
-              <w:top w:val="single" w:sz="4" w:space="0" w:color="000000"/>
-              <w:left w:val="single" w:sz="4" w:space="0" w:color="000000"/>
-              <w:bottom w:val="single" w:sz="4" w:space="0" w:color="000000"/>
-              <w:right w:val="single" w:sz="4" w:space="0" w:color="000000"/>
-            </w:tcBorders>
-            <w:shd w:val="clear" w:color="auto" w:fill="auto"/>
-            <w:vAlign w:val="center"/>
-          </w:tcPr>
-          <w:p>
-            <w:pPr>
-              <w:jc w:val="center"/>
-              <w:rPr>
-                <w:color w:val="000000"/>
-                <w:sz w:val="16"/>
-                <w:szCs w:val="16"/>
-                <w:lang w:val="uk-UA"/>
-              </w:rPr>
-            </w:pPr>
-            <w:proofErr w:type="spellStart"/>
-            <w:r>
-              <w:rPr>
-                <w:sz w:val="16"/>
-                <w:szCs w:val="16"/>
-              </w:rPr>
-              <w:t>Уповноважена</w:t>
-            </w:r>
-            <w:proofErr w:type="spellEnd"/>
-            <w:r>
-              <w:rPr>
-                <w:sz w:val="16"/>
-                <w:szCs w:val="16"/>
-              </w:rPr>
-              <w:t xml:space="preserve"> ОКУ в </w:t>
-            </w:r>
-            <w:proofErr w:type="spellStart"/>
-            <w:r>
-              <w:rPr>
-                <w:sz w:val="16"/>
-                <w:szCs w:val="16"/>
-              </w:rPr>
-              <w:t>Україні</w:t>
-            </w:r>
-            <w:proofErr w:type="spellEnd"/>
-            <w:r>
-              <w:rPr>
-                <w:sz w:val="16"/>
-                <w:szCs w:val="16"/>
-              </w:rPr>
-              <w:t xml:space="preserve">/ </w:t>
-            </w:r>
-            <w:proofErr w:type="spellStart"/>
-            <w:r>
-              <w:rPr>
-                <w:sz w:val="16"/>
-                <w:szCs w:val="16"/>
-              </w:rPr>
-              <w:t>Субвидавець</w:t>
-            </w:r>
-            <w:proofErr w:type="spellEnd"/>
-          </w:p>
-        </w:tc>
-      </w:tr>
-    </w:tbl>
+    <w:sdt>
+      <w:sdtPr>
+        <w:rPr>
+          <w:sz w:val="20"/>
+          <w:szCs w:val="20"/>
+          <w:lang w:val="uk-UA"/>
+        </w:rPr>
+        <w:alias w:val="TableObjFixIdent"/>
+        <w:tag w:val="TableObjFixIdent"/>
+        <w:id w:val="589886338"/>
+        <w:placeholder>
+          <w:docPart w:val="DefaultPlaceholder_-1854013436"/>
+        </w:placeholder>
+        <w15:appearance w15:val="tags"/>
+        <w:docPartList>
+          <w:docPartGallery w:val="Tables"/>
+        </w:docPartList>
+      </w:sdtPr>
+      <w:sdtEndPr/>
+      <w:sdtContent>
+        <w:p>
+          <w:pPr>
+            <w:pStyle w:val="af2"/>
+            <w:ind w:left="0" w:firstLine="709"/>
+            <w:jc w:val="both"/>
+            <w:rPr>
+              <w:sz w:val="20"/>
+              <w:szCs w:val="20"/>
+              <w:lang w:val="uk-UA"/>
+            </w:rPr>
+          </w:pPr>
+        </w:p>
+        <w:tbl>
+          <w:tblPr>
+            <w:tblW w:w="10869" w:type="dxa"/>
+            <w:tblInd w:w="108" w:type="dxa"/>
+            <w:tblLayout w:type="fixed"/>
+            <w:tblLook w:val="0000" w:firstRow="0" w:lastRow="0" w:firstColumn="0" w:lastColumn="0" w:noHBand="0" w:noVBand="0"/>
+          </w:tblPr>
+          <w:tblGrid>
+            <w:gridCol w:w="426"/>
+            <w:gridCol w:w="992"/>
+            <w:gridCol w:w="1231"/>
+            <w:gridCol w:w="895"/>
+            <w:gridCol w:w="851"/>
+            <w:gridCol w:w="1559"/>
+            <w:gridCol w:w="1417"/>
+            <w:gridCol w:w="993"/>
+            <w:gridCol w:w="933"/>
+            <w:gridCol w:w="1572"/>
+          </w:tblGrid>
+          <w:tr>
+            <w:trPr>
+              <w:trHeight w:val="638"/>
+            </w:trPr>
+            <w:tc>
+              <w:tcPr>
+                <w:tcW w:w="426" w:type="dxa"/>
+                <w:tcBorders>
+                  <w:top w:val="single" w:sz="4" w:space="0" w:color="000000"/>
+                  <w:left w:val="single" w:sz="4" w:space="0" w:color="000000"/>
+                  <w:bottom w:val="single" w:sz="4" w:space="0" w:color="000000"/>
+                </w:tcBorders>
+                <w:shd w:val="clear" w:color="auto" w:fill="auto"/>
+                <w:vAlign w:val="center"/>
+              </w:tcPr>
+              <w:p>
+                <w:pPr>
+                  <w:jc w:val="center"/>
+                  <w:rPr>
+                    <w:b/>
+                    <w:sz w:val="16"/>
+                    <w:szCs w:val="16"/>
+                    <w:lang w:val="uk-UA"/>
+                  </w:rPr>
+                </w:pPr>
+                <w:r>
+                  <w:rPr>
+                    <w:b/>
+                    <w:sz w:val="16"/>
+                    <w:szCs w:val="16"/>
+                    <w:lang w:val="uk-UA"/>
+                  </w:rPr>
+                  <w:t>№ п/п</w:t>
+                </w:r>
+              </w:p>
+            </w:tc>
+            <w:tc>
+              <w:tcPr>
+                <w:tcW w:w="992" w:type="dxa"/>
+                <w:tcBorders>
+                  <w:top w:val="single" w:sz="4" w:space="0" w:color="000000"/>
+                  <w:left w:val="single" w:sz="4" w:space="0" w:color="000000"/>
+                  <w:bottom w:val="single" w:sz="4" w:space="0" w:color="000000"/>
+                </w:tcBorders>
+                <w:shd w:val="clear" w:color="auto" w:fill="auto"/>
+                <w:vAlign w:val="center"/>
+              </w:tcPr>
+              <w:p>
+                <w:pPr>
+                  <w:jc w:val="center"/>
+                  <w:rPr>
+                    <w:b/>
+                    <w:sz w:val="16"/>
+                    <w:szCs w:val="16"/>
+                  </w:rPr>
+                </w:pPr>
+                <w:r>
+                  <w:rPr>
+                    <w:b/>
+                    <w:sz w:val="16"/>
+                    <w:szCs w:val="16"/>
+                    <w:lang w:val="uk-UA"/>
+                  </w:rPr>
+                  <w:t>Назва твору</w:t>
+                </w:r>
+              </w:p>
+            </w:tc>
+            <w:tc>
+              <w:tcPr>
+                <w:tcW w:w="1231" w:type="dxa"/>
+                <w:tcBorders>
+                  <w:top w:val="single" w:sz="4" w:space="0" w:color="000000"/>
+                  <w:left w:val="single" w:sz="4" w:space="0" w:color="000000"/>
+                  <w:bottom w:val="single" w:sz="4" w:space="0" w:color="000000"/>
+                </w:tcBorders>
+                <w:shd w:val="clear" w:color="auto" w:fill="auto"/>
+                <w:vAlign w:val="center"/>
+              </w:tcPr>
+              <w:p>
+                <w:pPr>
+                  <w:jc w:val="center"/>
+                  <w:rPr>
+                    <w:b/>
+                    <w:sz w:val="16"/>
+                    <w:szCs w:val="16"/>
+                  </w:rPr>
+                </w:pPr>
+                <w:proofErr w:type="spellStart"/>
+                <w:r>
+                  <w:rPr>
+                    <w:b/>
+                    <w:sz w:val="16"/>
+                    <w:szCs w:val="16"/>
+                  </w:rPr>
+                  <w:t>Викона</w:t>
+                </w:r>
+                <w:proofErr w:type="spellEnd"/>
+                <w:r>
+                  <w:rPr>
+                    <w:b/>
+                    <w:sz w:val="16"/>
+                    <w:szCs w:val="16"/>
+                  </w:rPr>
+                  <w:t>-</w:t>
+                </w:r>
+              </w:p>
+              <w:p>
+                <w:pPr>
+                  <w:jc w:val="center"/>
+                  <w:rPr>
+                    <w:b/>
+                    <w:sz w:val="16"/>
+                    <w:szCs w:val="16"/>
+                  </w:rPr>
+                </w:pPr>
+                <w:proofErr w:type="spellStart"/>
+                <w:r>
+                  <w:rPr>
+                    <w:b/>
+                    <w:sz w:val="16"/>
+                    <w:szCs w:val="16"/>
+                  </w:rPr>
+                  <w:t>вець</w:t>
+                </w:r>
+                <w:proofErr w:type="spellEnd"/>
+              </w:p>
+            </w:tc>
+            <w:tc>
+              <w:tcPr>
+                <w:tcW w:w="895" w:type="dxa"/>
+                <w:tcBorders>
+                  <w:top w:val="single" w:sz="4" w:space="0" w:color="000000"/>
+                  <w:left w:val="single" w:sz="4" w:space="0" w:color="000000"/>
+                  <w:bottom w:val="single" w:sz="4" w:space="0" w:color="000000"/>
+                </w:tcBorders>
+                <w:vAlign w:val="center"/>
+              </w:tcPr>
+              <w:p>
+                <w:pPr>
+                  <w:jc w:val="center"/>
+                  <w:rPr>
+                    <w:b/>
+                    <w:sz w:val="16"/>
+                    <w:szCs w:val="16"/>
+                    <w:lang w:val="uk-UA"/>
+                  </w:rPr>
+                </w:pPr>
+                <w:r>
+                  <w:rPr>
+                    <w:b/>
+                    <w:sz w:val="16"/>
+                    <w:szCs w:val="16"/>
+                    <w:lang w:val="uk-UA"/>
+                  </w:rPr>
+                  <w:t>Час початку звучання твору *</w:t>
+                </w:r>
+              </w:p>
+            </w:tc>
+            <w:tc>
+              <w:tcPr>
+                <w:tcW w:w="851" w:type="dxa"/>
+                <w:tcBorders>
+                  <w:top w:val="single" w:sz="4" w:space="0" w:color="000000"/>
+                  <w:left w:val="single" w:sz="4" w:space="0" w:color="000000"/>
+                  <w:bottom w:val="single" w:sz="4" w:space="0" w:color="000000"/>
+                  <w:right w:val="single" w:sz="4" w:space="0" w:color="000000"/>
+                </w:tcBorders>
+                <w:vAlign w:val="center"/>
+              </w:tcPr>
+              <w:p>
+                <w:pPr>
+                  <w:jc w:val="center"/>
+                  <w:rPr>
+                    <w:b/>
+                    <w:sz w:val="16"/>
+                    <w:szCs w:val="16"/>
+                    <w:lang w:val="uk-UA"/>
+                  </w:rPr>
+                </w:pPr>
+                <w:r>
+                  <w:rPr>
+                    <w:b/>
+                    <w:sz w:val="16"/>
+                    <w:szCs w:val="16"/>
+                    <w:lang w:val="uk-UA"/>
+                  </w:rPr>
+                  <w:t>Час закінчення звучання твору *</w:t>
+                </w:r>
+              </w:p>
+            </w:tc>
+            <w:tc>
+              <w:tcPr>
+                <w:tcW w:w="1559" w:type="dxa"/>
+                <w:tcBorders>
+                  <w:top w:val="single" w:sz="4" w:space="0" w:color="000000"/>
+                  <w:left w:val="single" w:sz="4" w:space="0" w:color="000000"/>
+                  <w:bottom w:val="single" w:sz="4" w:space="0" w:color="000000"/>
+                </w:tcBorders>
+                <w:shd w:val="clear" w:color="auto" w:fill="auto"/>
+                <w:vAlign w:val="center"/>
+              </w:tcPr>
+              <w:p>
+                <w:pPr>
+                  <w:jc w:val="center"/>
+                  <w:rPr>
+                    <w:b/>
+                    <w:sz w:val="16"/>
+                    <w:szCs w:val="16"/>
+                  </w:rPr>
+                </w:pPr>
+                <w:bookmarkStart w:id="0" w:name="_GoBack"/>
+                <w:bookmarkEnd w:id="0"/>
+                <w:proofErr w:type="spellStart"/>
+                <w:r>
+                  <w:rPr>
+                    <w:b/>
+                    <w:sz w:val="16"/>
+                    <w:szCs w:val="16"/>
+                  </w:rPr>
+                  <w:t>Творча</w:t>
+                </w:r>
+                <w:proofErr w:type="spellEnd"/>
+                <w:r>
+                  <w:rPr>
+                    <w:b/>
+                    <w:sz w:val="16"/>
+                    <w:szCs w:val="16"/>
+                  </w:rPr>
+                  <w:t xml:space="preserve"> роль</w:t>
+                </w:r>
+              </w:p>
+            </w:tc>
+            <w:tc>
+              <w:tcPr>
+                <w:tcW w:w="1417" w:type="dxa"/>
+                <w:tcBorders>
+                  <w:top w:val="single" w:sz="4" w:space="0" w:color="000000"/>
+                  <w:left w:val="single" w:sz="4" w:space="0" w:color="000000"/>
+                  <w:bottom w:val="single" w:sz="4" w:space="0" w:color="000000"/>
+                </w:tcBorders>
+                <w:shd w:val="clear" w:color="auto" w:fill="auto"/>
+                <w:vAlign w:val="center"/>
+              </w:tcPr>
+              <w:p>
+                <w:pPr>
+                  <w:jc w:val="center"/>
+                  <w:rPr>
+                    <w:b/>
+                    <w:sz w:val="16"/>
+                    <w:szCs w:val="16"/>
+                  </w:rPr>
+                </w:pPr>
+                <w:proofErr w:type="spellStart"/>
+                <w:r>
+                  <w:rPr>
+                    <w:b/>
+                    <w:sz w:val="16"/>
+                    <w:szCs w:val="16"/>
+                  </w:rPr>
+                  <w:t>Ім’я</w:t>
+                </w:r>
+                <w:proofErr w:type="spellEnd"/>
+                <w:r>
+                  <w:rPr>
+                    <w:b/>
+                    <w:sz w:val="16"/>
+                    <w:szCs w:val="16"/>
+                  </w:rPr>
+                  <w:t xml:space="preserve"> / </w:t>
+                </w:r>
+                <w:proofErr w:type="spellStart"/>
+                <w:r>
+                  <w:rPr>
+                    <w:b/>
+                    <w:sz w:val="16"/>
+                    <w:szCs w:val="16"/>
+                  </w:rPr>
+                  <w:t>Назва</w:t>
+                </w:r>
+                <w:proofErr w:type="spellEnd"/>
+                <w:r>
+                  <w:rPr>
+                    <w:b/>
+                    <w:sz w:val="16"/>
+                    <w:szCs w:val="16"/>
+                  </w:rPr>
+                  <w:t xml:space="preserve"> / </w:t>
+                </w:r>
+                <w:proofErr w:type="spellStart"/>
+                <w:r>
+                  <w:rPr>
+                    <w:b/>
+                    <w:sz w:val="16"/>
+                    <w:szCs w:val="16"/>
+                  </w:rPr>
+                  <w:t>Оригінальний</w:t>
+                </w:r>
+                <w:proofErr w:type="spellEnd"/>
+                <w:r>
+                  <w:rPr>
+                    <w:b/>
+                    <w:sz w:val="16"/>
+                    <w:szCs w:val="16"/>
+                  </w:rPr>
+                  <w:t xml:space="preserve"> </w:t>
+                </w:r>
+                <w:proofErr w:type="spellStart"/>
+                <w:r>
+                  <w:rPr>
+                    <w:b/>
+                    <w:sz w:val="16"/>
+                    <w:szCs w:val="16"/>
+                  </w:rPr>
+                  <w:t>правовласник</w:t>
+                </w:r>
+                <w:proofErr w:type="spellEnd"/>
+              </w:p>
+            </w:tc>
+            <w:tc>
+              <w:tcPr>
+                <w:tcW w:w="993" w:type="dxa"/>
+                <w:tcBorders>
+                  <w:top w:val="single" w:sz="4" w:space="0" w:color="000000"/>
+                  <w:left w:val="single" w:sz="4" w:space="0" w:color="000000"/>
+                  <w:bottom w:val="single" w:sz="4" w:space="0" w:color="000000"/>
+                </w:tcBorders>
+                <w:shd w:val="clear" w:color="auto" w:fill="auto"/>
+                <w:vAlign w:val="center"/>
+              </w:tcPr>
+              <w:p>
+                <w:pPr>
+                  <w:jc w:val="center"/>
+                  <w:rPr>
+                    <w:b/>
+                    <w:sz w:val="16"/>
+                    <w:szCs w:val="16"/>
+                  </w:rPr>
+                </w:pPr>
+                <w:proofErr w:type="spellStart"/>
+                <w:r>
+                  <w:rPr>
+                    <w:b/>
+                    <w:sz w:val="16"/>
+                    <w:szCs w:val="16"/>
+                  </w:rPr>
+                  <w:t>Іноземне</w:t>
+                </w:r>
+                <w:proofErr w:type="spellEnd"/>
+                <w:r>
+                  <w:rPr>
+                    <w:b/>
+                    <w:sz w:val="16"/>
+                    <w:szCs w:val="16"/>
+                    <w:lang w:val="uk-UA"/>
+                  </w:rPr>
+                  <w:t xml:space="preserve"> авторсько-правове товариство</w:t>
+                </w:r>
+              </w:p>
+            </w:tc>
+            <w:tc>
+              <w:tcPr>
+                <w:tcW w:w="933" w:type="dxa"/>
+                <w:tcBorders>
+                  <w:top w:val="single" w:sz="4" w:space="0" w:color="000000"/>
+                  <w:left w:val="single" w:sz="4" w:space="0" w:color="000000"/>
+                  <w:bottom w:val="single" w:sz="4" w:space="0" w:color="000000"/>
+                </w:tcBorders>
+                <w:shd w:val="clear" w:color="auto" w:fill="auto"/>
+                <w:vAlign w:val="center"/>
+              </w:tcPr>
+              <w:p>
+                <w:pPr>
+                  <w:jc w:val="center"/>
+                  <w:rPr>
+                    <w:b/>
+                    <w:sz w:val="16"/>
+                    <w:szCs w:val="16"/>
+                    <w:lang w:val="uk-UA"/>
+                  </w:rPr>
+                </w:pPr>
+                <w:proofErr w:type="spellStart"/>
+                <w:r>
+                  <w:rPr>
+                    <w:b/>
+                    <w:sz w:val="16"/>
+                    <w:szCs w:val="16"/>
+                  </w:rPr>
+                  <w:t>Частка</w:t>
+                </w:r>
+                <w:proofErr w:type="spellEnd"/>
+                <w:r>
+                  <w:rPr>
+                    <w:b/>
+                    <w:sz w:val="16"/>
+                    <w:szCs w:val="16"/>
+                    <w:lang w:val="uk-UA"/>
+                  </w:rPr>
+                  <w:t xml:space="preserve"> належної авторської винагороди</w:t>
+                </w:r>
+              </w:p>
+            </w:tc>
+            <w:tc>
+              <w:tcPr>
+                <w:tcW w:w="1572" w:type="dxa"/>
+                <w:tcBorders>
+                  <w:top w:val="single" w:sz="4" w:space="0" w:color="000000"/>
+                  <w:left w:val="single" w:sz="4" w:space="0" w:color="000000"/>
+                  <w:bottom w:val="single" w:sz="4" w:space="0" w:color="000000"/>
+                  <w:right w:val="single" w:sz="4" w:space="0" w:color="000000"/>
+                </w:tcBorders>
+                <w:shd w:val="clear" w:color="auto" w:fill="auto"/>
+                <w:vAlign w:val="center"/>
+              </w:tcPr>
+              <w:p>
+                <w:pPr>
+                  <w:jc w:val="center"/>
+                  <w:rPr>
+                    <w:b/>
+                    <w:color w:val="000000"/>
+                    <w:sz w:val="16"/>
+                    <w:szCs w:val="16"/>
+                    <w:lang w:val="uk-UA"/>
+                  </w:rPr>
+                </w:pPr>
+                <w:proofErr w:type="spellStart"/>
+                <w:r>
+                  <w:rPr>
+                    <w:b/>
+                    <w:sz w:val="16"/>
+                    <w:szCs w:val="16"/>
+                  </w:rPr>
+                  <w:t>Уповноважена</w:t>
+                </w:r>
+                <w:proofErr w:type="spellEnd"/>
+                <w:r>
+                  <w:rPr>
+                    <w:b/>
+                    <w:sz w:val="16"/>
+                    <w:szCs w:val="16"/>
+                  </w:rPr>
+                  <w:t xml:space="preserve"> ОКУ в </w:t>
+                </w:r>
+                <w:proofErr w:type="spellStart"/>
+                <w:r>
+                  <w:rPr>
+                    <w:b/>
+                    <w:sz w:val="16"/>
+                    <w:szCs w:val="16"/>
+                  </w:rPr>
+                  <w:t>Україні</w:t>
+                </w:r>
+                <w:proofErr w:type="spellEnd"/>
+                <w:r>
+                  <w:rPr>
+                    <w:b/>
+                    <w:sz w:val="16"/>
+                    <w:szCs w:val="16"/>
+                  </w:rPr>
+                  <w:t xml:space="preserve">/ </w:t>
+                </w:r>
+                <w:proofErr w:type="spellStart"/>
+                <w:r>
+                  <w:rPr>
+                    <w:b/>
+                    <w:sz w:val="16"/>
+                    <w:szCs w:val="16"/>
+                  </w:rPr>
+                  <w:t>Субвидавець</w:t>
+                </w:r>
+                <w:proofErr w:type="spellEnd"/>
+              </w:p>
+            </w:tc>
+          </w:tr>
+        </w:tbl>
+        <w:p>
+          <w:pPr>
+            <w:pStyle w:val="af2"/>
+            <w:ind w:left="0" w:firstLine="709"/>
+            <w:jc w:val="both"/>
+            <w:rPr>
+              <w:sz w:val="20"/>
+              <w:szCs w:val="20"/>
+              <w:lang w:val="uk-UA"/>
+            </w:rPr>
+          </w:pPr>
+        </w:p>
+      </w:sdtContent>
+    </w:sdt>
     <w:p>
       <w:pPr>
-        <w:rPr>
-          <w:sz w:val="20"/>
-          <w:szCs w:val="20"/>
+        <w:pStyle w:val="af2"/>
+        <w:ind w:left="0" w:firstLine="709"/>
+        <w:jc w:val="both"/>
+        <w:rPr>
+          <w:sz w:val="20"/>
+          <w:szCs w:val="20"/>
+          <w:lang w:val="uk-UA"/>
         </w:rPr>
       </w:pPr>
     </w:p>
@@ -905,15 +923,16 @@
           <w:rPr>
             <w:sz w:val="20"/>
             <w:szCs w:val="20"/>
-            <w:lang w:val="en-US"/>
+            <w:lang w:val="uk-UA"/>
           </w:rPr>
-          <w:alias w:val="fixDeviceName"/>
-          <w:tag w:val="fixDeviceName"/>
-          <w:id w:val="1366097712"/>
+          <w:alias w:val="fixDevice"/>
+          <w:tag w:val="fixDevice"/>
+          <w:id w:val="2131355944"/>
           <w:placeholder>
-            <w:docPart w:val="07BFA03C9C234AC4A03C352ADBE859AB"/>
+            <w:docPart w:val="DefaultPlaceholder_-1854013440"/>
           </w:placeholder>
           <w:showingPlcHdr/>
+          <w15:appearance w15:val="tags"/>
           <w:text/>
         </w:sdtPr>
         <w:sdtEndPr/>
@@ -960,8 +979,6 @@
           <w:szCs w:val="20"/>
         </w:rPr>
       </w:pPr>
-      <w:bookmarkStart w:id="0" w:name="_GoBack"/>
-      <w:bookmarkEnd w:id="0"/>
     </w:p>
     <w:p>
       <w:pPr>
@@ -1439,7 +1456,7 @@
     <w:lsdException w:name="Table Web 2" w:semiHidden="1" w:unhideWhenUsed="1"/>
     <w:lsdException w:name="Table Web 3" w:semiHidden="1" w:unhideWhenUsed="1"/>
     <w:lsdException w:name="Balloon Text" w:semiHidden="1" w:unhideWhenUsed="1"/>
-    <w:lsdException w:name="Table Grid" w:semiHidden="1" w:uiPriority="59" w:unhideWhenUsed="1"/>
+    <w:lsdException w:name="Table Grid" w:uiPriority="59"/>
     <w:lsdException w:name="Table Theme" w:semiHidden="1" w:unhideWhenUsed="1"/>
     <w:lsdException w:name="Placeholder Text" w:semiHidden="1"/>
     <w:lsdException w:name="No Spacing" w:uiPriority="1" w:qFormat="1"/>
@@ -2061,35 +2078,6 @@
   <w:docParts>
     <w:docPart>
       <w:docPartPr>
-        <w:name w:val="07BFA03C9C234AC4A03C352ADBE859AB"/>
-        <w:category>
-          <w:name w:val="Общие"/>
-          <w:gallery w:val="placeholder"/>
-        </w:category>
-        <w:types>
-          <w:type w:val="bbPlcHdr"/>
-        </w:types>
-        <w:behaviors>
-          <w:behavior w:val="content"/>
-        </w:behaviors>
-        <w:guid w:val="{DD51C6C3-7179-422A-8903-15FA702089DA}"/>
-      </w:docPartPr>
-      <w:docPartBody>
-        <w:p>
-          <w:pPr>
-            <w:pStyle w:val="07BFA03C9C234AC4A03C352ADBE859AB"/>
-          </w:pPr>
-          <w:r>
-            <w:rPr>
-              <w:rStyle w:val="a3"/>
-            </w:rPr>
-            <w:t>Место для ввода текста.</w:t>
-          </w:r>
-        </w:p>
-      </w:docPartBody>
-    </w:docPart>
-    <w:docPart>
-      <w:docPartPr>
         <w:name w:val="DefaultPlaceholder_1082065158"/>
         <w:category>
           <w:name w:val="Общие"/>
@@ -2102,6 +2090,58 @@
           <w:behavior w:val="content"/>
         </w:behaviors>
         <w:guid w:val="{53E4D548-F87B-49BE-BCF3-75C2993D5C7B}"/>
+      </w:docPartPr>
+      <w:docPartBody>
+        <w:p>
+          <w:r>
+            <w:rPr>
+              <w:rStyle w:val="a3"/>
+            </w:rPr>
+            <w:t>Место для ввода текста.</w:t>
+          </w:r>
+        </w:p>
+      </w:docPartBody>
+    </w:docPart>
+    <w:docPart>
+      <w:docPartPr>
+        <w:name w:val="DefaultPlaceholder_-1854013436"/>
+        <w:category>
+          <w:name w:val="Общие"/>
+          <w:gallery w:val="placeholder"/>
+        </w:category>
+        <w:types>
+          <w:type w:val="bbPlcHdr"/>
+        </w:types>
+        <w:behaviors>
+          <w:behavior w:val="content"/>
+        </w:behaviors>
+        <w:guid w:val="{EB9D1FF3-540F-4ECD-8FFF-41A50F3EB956}"/>
+      </w:docPartPr>
+      <w:docPartBody>
+        <w:p>
+          <w:r>
+            <w:rPr>
+              <w:rStyle w:val="a3"/>
+            </w:rPr>
+            <w:t>Выберите стандартный блок.</w:t>
+          </w:r>
+        </w:p>
+      </w:docPartBody>
+    </w:docPart>
+    <w:docPart>
+      <w:docPartPr>
+        <w:name w:val="DefaultPlaceholder_-1854013440"/>
+        <w:category>
+          <w:name w:val="Общие"/>
+          <w:gallery w:val="placeholder"/>
+        </w:category>
+        <w:types>
+          <w:type w:val="bbPlcHdr"/>
+        </w:types>
+        <w:behaviors>
+          <w:behavior w:val="content"/>
+        </w:behaviors>
+        <w:guid w:val="{6F0973D1-98FE-4F7C-A0EA-0B33E917CA92}"/>
       </w:docPartPr>
       <w:docPartBody>
         <w:p>
@@ -2212,8 +2252,10 @@
   </w:compat>
   <w:rsids>
     <w:rsidRoot w:val="00392E2E"/>
+    <w:rsid w:val="0026006A"/>
     <w:rsid w:val="00392E2E"/>
     <w:rsid w:val="005B078F"/>
+    <w:rsid w:val="0085320D"/>
   </w:rsids>
   <m:mathPr>
     <m:mathFont m:val="Cambria Math"/>
@@ -2407,7 +2449,7 @@
     <w:lsdException w:name="Table Web 2" w:semiHidden="1" w:unhideWhenUsed="1"/>
     <w:lsdException w:name="Table Web 3" w:semiHidden="1" w:unhideWhenUsed="1"/>
     <w:lsdException w:name="Balloon Text" w:semiHidden="1" w:unhideWhenUsed="1"/>
-    <w:lsdException w:name="Table Grid" w:semiHidden="1" w:uiPriority="59" w:unhideWhenUsed="1"/>
+    <w:lsdException w:name="Table Grid" w:uiPriority="59"/>
     <w:lsdException w:name="Table Theme" w:semiHidden="1" w:unhideWhenUsed="1"/>
     <w:lsdException w:name="Placeholder Text" w:semiHidden="1"/>
     <w:lsdException w:name="No Spacing" w:uiPriority="1" w:qFormat="1"/>
@@ -2665,7 +2707,7 @@
     <w:basedOn w:val="a0"/>
     <w:uiPriority w:val="99"/>
     <w:semiHidden/>
-    <w:rsid w:val="00392E2E"/>
+    <w:rsid w:val="0085320D"/>
     <w:rPr>
       <w:color w:val="808080"/>
     </w:rPr>
@@ -2974,7 +3016,7 @@
 </file>
 
 <file path=customXml/itemProps1.xml><?xml version="1.0" encoding="utf-8"?>
-<ds:datastoreItem xmlns:ds="http://schemas.openxmlformats.org/officeDocument/2006/customXml" ds:itemID="{8C7C4E82-FD59-4AB4-994E-76C85F737D13}">
+<ds:datastoreItem xmlns:ds="http://schemas.openxmlformats.org/officeDocument/2006/customXml" ds:itemID="{6CA8E2E3-DFDB-4E37-99B2-A4FD8B2F604D}">
   <ds:schemaRefs>
     <ds:schemaRef ds:uri="http://schemas.openxmlformats.org/officeDocument/2006/bibliography"/>
   </ds:schemaRefs>

</xml_diff>